<commit_message>
docs: add expanded research report, technical design document, and user stories
- Research report expanded to ~44 pages: styled dark/grid C4 diagrams, Gantt chart, attack/defend lab section, and a frontend gallery in both light and dark themes.

- New Technical Design Document (additional-docs/) covering user stories, architecture, data model, API, runtime flows and a traceability matrix.

- Styled user-story cards (HTML) with per-epic screenshots.

- Helper scripts for frontend/C4/user-story capture and diagram/report/TDD generation.
</commit_message>
<xml_diff>
--- a/docs/Research_Report.docx
+++ b/docs/Research_Report.docx
@@ -17,7 +17,7 @@
     </w:p>
     <w:p>
       <w:pPr>
-        <w:jc w:val="both"/>
+        <w:jc w:val="center"/>
       </w:pPr>
       <w:r>
         <w:rPr>
@@ -1118,7 +1118,7 @@
     <w:p>
       <w:pPr>
         <w:spacing w:after="240"/>
-        <w:jc w:val="both"/>
+        <w:jc w:val="center"/>
       </w:pPr>
       <w:r>
         <w:rPr>
@@ -1266,7 +1266,7 @@
     <w:p>
       <w:pPr>
         <w:spacing w:after="240"/>
-        <w:jc w:val="both"/>
+        <w:jc w:val="center"/>
       </w:pPr>
       <w:r>
         <w:rPr>
@@ -1326,7 +1326,7 @@
     <w:p>
       <w:pPr>
         <w:spacing w:after="240"/>
-        <w:jc w:val="both"/>
+        <w:jc w:val="center"/>
       </w:pPr>
       <w:r>
         <w:rPr>

</xml_diff>